<commit_message>
feat: centralize business address profile
</commit_message>
<xml_diff>
--- a/docs/legal/ReadyPackets_Prospective_Partner_MNDA_Draft.docx
+++ b/docs/legal/ReadyPackets_Prospective_Partner_MNDA_Draft.docx
@@ -207,7 +207,7 @@
           <w:color w:val="5C6875"/>
           <w:sz w:val="18"/>
         </w:rPr>
-        <w:t>Ready Packets Consulting LLC · New York, New York</w:t>
+        <w:t>Ready Packets Consulting LLC · Lanham, Maryland</w:t>
       </w:r>
     </w:p>
     <w:p>
@@ -274,7 +274,7 @@
           <w:color w:val="202A34"/>
           <w:sz w:val="20"/>
         </w:rPr>
-        <w:t>This Mutual Non-Disclosure Agreement (this Agreement) is entered into as of the Effective Date by and between Ready Packets Consulting LLC, doing business as ReadyPackets (ReadyPackets), with an address at 347 5th Avenue, Suite 1402-158, New York, NY 10016, and [PARTNER LEGAL NAME], a [STATE/COUNTRY AND ENTITY TYPE] with an address at [PARTNER BUSINESS ADDRESS] (Partner). ReadyPackets and Partner are each a Party and collectively the Parties.</w:t>
+        <w:t>This Mutual Non-Disclosure Agreement (this Agreement) is entered into as of the Effective Date by and between Ready Packets Consulting LLC, doing business as ReadyPackets (ReadyPackets), with an address at 7404 Executive Pl, Lanham, MD 20706, and [PARTNER LEGAL NAME], a [STATE/COUNTRY AND ENTITY TYPE] with an address at [PARTNER BUSINESS ADDRESS] (Partner). ReadyPackets and Partner are each a Party and collectively the Parties.</w:t>
       </w:r>
     </w:p>
     <w:p>

</xml_diff>